<commit_message>
docs(planning): add 20-week development Gantt chart
</commit_message>
<xml_diff>
--- a/docs/deliverables/HMS-Core-Modules-and-Development-Timeline.docx
+++ b/docs/deliverables/HMS-Core-Modules-and-Development-Timeline.docx
@@ -3457,10 +3457,92 @@
         <w:t>Source baseline: origin/dev at e593a8f, reviewed 24 October 2026. The module scope and phase order come from the repository; the 20-week maximum is the owner's requested constraint; allocations and staffing are planning estimates. Deploy impact of this documentation change: none.</w:t>
       </w:r>
     </w:p>
+    <w:p>
+      <w:pPr>
+        <w:sectPr>
+          <w:footerReference w:type="default" r:id="rId9"/>
+          <w:pgSz w:w="12240" w:h="15840"/>
+          <w:pgMar w:top="1008" w:right="1080" w:bottom="936" w:left="1080" w:header="720" w:footer="432" w:gutter="0"/>
+          <w:cols w:space="720"/>
+          <w:docGrid w:linePitch="360"/>
+        </w:sectPr>
+      </w:pPr>
+    </w:p>
+    <w:p>
+      <w:pPr>
+        <w:pStyle w:val="Heading1"/>
+        <w:spacing w:before="0" w:after="100"/>
+      </w:pPr>
+      <w:r>
+        <w:t>Development timeline Gantt chart</w:t>
+      </w:r>
+    </w:p>
+    <w:p>
+      <w:pPr>
+        <w:spacing w:after="60"/>
+      </w:pPr>
+      <w:r>
+        <w:t>The 20-week plan uses parallel AI-assisted development. Bars show planned work windows; acceptance weeks remain part of each release slice. All open scope and staffing assumptions in the preceding pages still apply.</w:t>
+      </w:r>
+    </w:p>
+    <w:p>
+      <w:r>
+        <w:drawing>
+          <wp:inline xmlns:a="http://schemas.openxmlformats.org/drawingml/2006/main" xmlns:pic="http://schemas.openxmlformats.org/drawingml/2006/picture">
+            <wp:extent cx="8961120" cy="4779264"/>
+            <wp:docPr id="1" name="Picture 1" descr="Gantt chart for Weeks 1 to 20 covering platform, outpatient, inpatient, operations, enterprise, website, integrations, QA and contingency. Milestones: pilot readiness W8, inpatient W12, operations W16, feature complete W18, acceptance W19 and handoff W20."/>
+            <wp:cNvGraphicFramePr>
+              <a:graphicFrameLocks noChangeAspect="1"/>
+            </wp:cNvGraphicFramePr>
+            <a:graphic>
+              <a:graphicData uri="http://schemas.openxmlformats.org/drawingml/2006/picture">
+                <pic:pic>
+                  <pic:nvPicPr>
+                    <pic:cNvPr id="0" name="HMS-Development-Gantt.png"/>
+                    <pic:cNvPicPr/>
+                  </pic:nvPicPr>
+                  <pic:blipFill>
+                    <a:blip r:embed="rId10"/>
+                    <a:stretch>
+                      <a:fillRect/>
+                    </a:stretch>
+                  </pic:blipFill>
+                  <pic:spPr>
+                    <a:xfrm>
+                      <a:off x="0" y="0"/>
+                      <a:ext cx="8961120" cy="4779264"/>
+                    </a:xfrm>
+                    <a:prstGeom prst="rect"/>
+                  </pic:spPr>
+                </pic:pic>
+              </a:graphicData>
+            </a:graphic>
+          </wp:inline>
+        </w:drawing>
+      </w:r>
+    </w:p>
+    <w:p>
+      <w:pPr>
+        <w:spacing w:after="80"/>
+      </w:pPr>
+      <w:r>
+        <w:rPr>
+          <w:sz w:val="20"/>
+        </w:rPr>
+        <w:t>Milestones: W8 RP-A pilot readiness; W12 inpatient acceptance; W16 operations acceptance; W18 feature complete; W19 integrated acceptance; W20 development handoff.</w:t>
+      </w:r>
+    </w:p>
+    <w:p>
+      <w:r>
+        <w:rPr>
+          <w:sz w:val="18"/>
+        </w:rPr>
+        <w:t>The lighter QA bar represents continuous testing during development. Website data work pauses between W12 and W15 while dependent clinical services mature. Deployment is separately owned by the project lead or teammate.</w:t>
+      </w:r>
+    </w:p>
     <w:sectPr>
-      <w:footerReference w:type="default" r:id="rId9"/>
-      <w:pgSz w:w="12240" w:h="15840"/>
-      <w:pgMar w:top="1008" w:right="1080" w:bottom="936" w:left="1080" w:header="720" w:footer="432" w:gutter="0"/>
+      <w:pgSz w:w="15840" w:h="12240" w:orient="landscape"/>
+      <w:pgMar w:top="792" w:right="864" w:bottom="720" w:left="864" w:header="720" w:footer="432" w:gutter="0"/>
       <w:cols w:space="720"/>
       <w:docGrid w:linePitch="360"/>
     </w:sectPr>

</xml_diff>